<commit_message>
Sidecard Update - see Dev notes in Teams
</commit_message>
<xml_diff>
--- a/docs/Computational Pathology/PathScribe_Computational_Sidecar_Dev_Notes.docx
+++ b/docs/Computational Pathology/PathScribe_Computational_Sidecar_Dev_Notes.docx
@@ -45,7 +45,7 @@
           <w:sz w:val="22"/>
           <w:szCs w:val="22"/>
         </w:rPr>
-        <w:t xml:space="preserve">Version 1.1  ·  May 2026  ·  Internal</w:t>
+        <w:t xml:space="preserve">Version 1.2  ·  May 2026  ·  Internal</w:t>
       </w:r>
     </w:p>
     <w:p>
@@ -83,7 +83,7 @@
           <w:sz w:val="22"/>
           <w:szCs w:val="22"/>
         </w:rPr>
-        <w:t xml:space="preserve">This document describes the Computational Sidecar feature built for PathScribe AI V1. It covers architecture decisions, file inventory, key data flows, known limitations, and the V2 backlog.</w:t>
+        <w:t xml:space="preserve">This document describes the Computational Sidecar feature for PathScribe AI V1. Version 1.2 covers significant fixes to specimen assignment, order/cancel persistence, WCAG 2.1 AA compliance, and navigator grouping.</w:t>
       </w:r>
     </w:p>
     <w:p>
@@ -126,27 +126,6 @@
           <w:szCs w:val="26"/>
         </w:rPr>
         <w:t xml:space="preserve">2.1 Dual-Tag Model</w:t>
-      </w:r>
-    </w:p>
-    <w:p>
-      <w:pPr>
-        <w:spacing w:after="80" w:before="80"/>
-      </w:pPr>
-      <w:r>
-        <w:rPr>
-          <w:rFonts w:ascii="Arial" w:cs="Arial" w:eastAsia="Arial" w:hAnsi="Arial"/>
-          <w:sz w:val="22"/>
-          <w:szCs w:val="22"/>
-        </w:rPr>
-        <w:t xml:space="preserve">The existing Flag system was extended with a tagClass discriminator. All flag behavior is driven by configuration, not code branching.</w:t>
-      </w:r>
-    </w:p>
-    <w:p>
-      <w:pPr>
-        <w:spacing w:after="80" w:before="80"/>
-      </w:pPr>
-      <w:r>
-        <w:t xml:space="preserve"/>
       </w:r>
     </w:p>
     <w:tbl>
@@ -486,7 +465,7 @@
           <w:sz w:val="18"/>
           <w:szCs w:val="18"/>
         </w:rPr>
-        <w:t xml:space="preserve">MockResultService     — 20+ synthetic results, keys use sourceId_caseId</w:t>
+        <w:t xml:space="preserve">MockResultService     — 20+ synthetic results (keys: sourceId_caseId)</w:t>
       </w:r>
     </w:p>
     <w:p>
@@ -526,377 +505,150 @@
           <w:sz w:val="26"/>
           <w:szCs w:val="26"/>
         </w:rPr>
-        <w:t xml:space="preserve">2.3 Data Source Types</w:t>
-      </w:r>
-    </w:p>
-    <w:tbl>
-      <w:tblPr>
-        <w:tblW w:type="dxa" w:w="9360"/>
-        <w:tblBorders>
-          <w:top w:val="single" w:color="auto" w:sz="4"/>
-          <w:left w:val="single" w:color="auto" w:sz="4"/>
-          <w:bottom w:val="single" w:color="auto" w:sz="4"/>
-          <w:right w:val="single" w:color="auto" w:sz="4"/>
-          <w:insideH w:val="single" w:color="auto" w:sz="4"/>
-          <w:insideV w:val="single" w:color="auto" w:sz="4"/>
-        </w:tblBorders>
-      </w:tblPr>
-      <w:tblGrid>
-        <w:gridCol w:w="2000"/>
-        <w:gridCol w:w="3000"/>
-        <w:gridCol w:w="4360"/>
-      </w:tblGrid>
-      <w:tr>
-        <w:trPr>
-          <w:tblHeader/>
-        </w:trPr>
-        <w:tc>
-          <w:tcPr>
-            <w:tcW w:type="dxa" w:w="2000"/>
-            <w:tcBorders>
-              <w:top w:val="single" w:color="D1D5DB" w:sz="1"/>
-              <w:left w:val="single" w:color="D1D5DB" w:sz="1"/>
-              <w:bottom w:val="single" w:color="D1D5DB" w:sz="1"/>
-              <w:right w:val="single" w:color="D1D5DB" w:sz="1"/>
-            </w:tcBorders>
-            <w:shd w:fill="0F172A" w:val="clear"/>
-            <w:tcMar>
-              <w:top w:type="dxa" w:w="100"/>
-              <w:left w:type="dxa" w:w="120"/>
-              <w:bottom w:type="dxa" w:w="100"/>
-              <w:right w:type="dxa" w:w="120"/>
-            </w:tcMar>
-          </w:tcPr>
-          <w:p>
-            <w:r>
-              <w:rPr>
-                <w:rFonts w:ascii="Arial" w:cs="Arial" w:eastAsia="Arial" w:hAnsi="Arial"/>
-                <w:b/>
-                <w:bCs/>
-                <w:color w:val="FFFFFF"/>
-                <w:sz w:val="20"/>
-                <w:szCs w:val="20"/>
-              </w:rPr>
-              <w:t xml:space="preserve">DataSourceType</w:t>
-            </w:r>
-          </w:p>
-        </w:tc>
-        <w:tc>
-          <w:tcPr>
-            <w:tcW w:type="dxa" w:w="3000"/>
-            <w:tcBorders>
-              <w:top w:val="single" w:color="D1D5DB" w:sz="1"/>
-              <w:left w:val="single" w:color="D1D5DB" w:sz="1"/>
-              <w:bottom w:val="single" w:color="D1D5DB" w:sz="1"/>
-              <w:right w:val="single" w:color="D1D5DB" w:sz="1"/>
-            </w:tcBorders>
-            <w:shd w:fill="0F172A" w:val="clear"/>
-            <w:tcMar>
-              <w:top w:type="dxa" w:w="100"/>
-              <w:left w:type="dxa" w:w="120"/>
-              <w:bottom w:type="dxa" w:w="100"/>
-              <w:right w:type="dxa" w:w="120"/>
-            </w:tcMar>
-          </w:tcPr>
-          <w:p>
-            <w:r>
-              <w:rPr>
-                <w:rFonts w:ascii="Arial" w:cs="Arial" w:eastAsia="Arial" w:hAnsi="Arial"/>
-                <w:b/>
-                <w:bCs/>
-                <w:color w:val="FFFFFF"/>
-                <w:sz w:val="20"/>
-                <w:szCs w:val="20"/>
-              </w:rPr>
-              <w:t xml:space="preserve">Endpoint Required</w:t>
-            </w:r>
-          </w:p>
-        </w:tc>
-        <w:tc>
-          <w:tcPr>
-            <w:tcW w:type="dxa" w:w="4360"/>
-            <w:tcBorders>
-              <w:top w:val="single" w:color="D1D5DB" w:sz="1"/>
-              <w:left w:val="single" w:color="D1D5DB" w:sz="1"/>
-              <w:bottom w:val="single" w:color="D1D5DB" w:sz="1"/>
-              <w:right w:val="single" w:color="D1D5DB" w:sz="1"/>
-            </w:tcBorders>
-            <w:shd w:fill="0F172A" w:val="clear"/>
-            <w:tcMar>
-              <w:top w:type="dxa" w:w="100"/>
-              <w:left w:type="dxa" w:w="120"/>
-              <w:bottom w:type="dxa" w:w="100"/>
-              <w:right w:type="dxa" w:w="120"/>
-            </w:tcMar>
-          </w:tcPr>
-          <w:p>
-            <w:r>
-              <w:rPr>
-                <w:rFonts w:ascii="Arial" w:cs="Arial" w:eastAsia="Arial" w:hAnsi="Arial"/>
-                <w:b/>
-                <w:bCs/>
-                <w:color w:val="FFFFFF"/>
-                <w:sz w:val="20"/>
-                <w:szCs w:val="20"/>
-              </w:rPr>
-              <w:t xml:space="preserve">Use Case</w:t>
-            </w:r>
-          </w:p>
-        </w:tc>
-      </w:tr>
-      <w:tr>
-        <w:tc>
-          <w:tcPr>
-            <w:tcW w:type="dxa" w:w="2000"/>
-            <w:tcBorders>
-              <w:top w:val="single" w:color="D1D5DB" w:sz="1"/>
-              <w:left w:val="single" w:color="D1D5DB" w:sz="1"/>
-              <w:bottom w:val="single" w:color="D1D5DB" w:sz="1"/>
-              <w:right w:val="single" w:color="D1D5DB" w:sz="1"/>
-            </w:tcBorders>
-            <w:tcMar>
-              <w:top w:type="dxa" w:w="100"/>
-              <w:left w:type="dxa" w:w="120"/>
-              <w:bottom w:type="dxa" w:w="100"/>
-              <w:right w:type="dxa" w:w="120"/>
-            </w:tcMar>
-          </w:tcPr>
-          <w:p>
-            <w:r>
-              <w:rPr>
-                <w:rFonts w:ascii="Arial" w:cs="Arial" w:eastAsia="Arial" w:hAnsi="Arial"/>
-                <w:sz w:val="20"/>
-                <w:szCs w:val="20"/>
-              </w:rPr>
-              <w:t xml:space="preserve">lis</w:t>
-            </w:r>
-          </w:p>
-        </w:tc>
-        <w:tc>
-          <w:tcPr>
-            <w:tcW w:type="dxa" w:w="3000"/>
-            <w:tcBorders>
-              <w:top w:val="single" w:color="D1D5DB" w:sz="1"/>
-              <w:left w:val="single" w:color="D1D5DB" w:sz="1"/>
-              <w:bottom w:val="single" w:color="D1D5DB" w:sz="1"/>
-              <w:right w:val="single" w:color="D1D5DB" w:sz="1"/>
-            </w:tcBorders>
-            <w:tcMar>
-              <w:top w:type="dxa" w:w="100"/>
-              <w:left w:type="dxa" w:w="120"/>
-              <w:bottom w:type="dxa" w:w="100"/>
-              <w:right w:type="dxa" w:w="120"/>
-            </w:tcMar>
-          </w:tcPr>
-          <w:p>
-            <w:r>
-              <w:rPr>
-                <w:rFonts w:ascii="Arial" w:cs="Arial" w:eastAsia="Arial" w:hAnsi="Arial"/>
-                <w:sz w:val="20"/>
-                <w:szCs w:val="20"/>
-              </w:rPr>
-              <w:t xml:space="preserve">Yes</w:t>
-            </w:r>
-          </w:p>
-        </w:tc>
-        <w:tc>
-          <w:tcPr>
-            <w:tcW w:type="dxa" w:w="4360"/>
-            <w:tcBorders>
-              <w:top w:val="single" w:color="D1D5DB" w:sz="1"/>
-              <w:left w:val="single" w:color="D1D5DB" w:sz="1"/>
-              <w:bottom w:val="single" w:color="D1D5DB" w:sz="1"/>
-              <w:right w:val="single" w:color="D1D5DB" w:sz="1"/>
-            </w:tcBorders>
-            <w:tcMar>
-              <w:top w:type="dxa" w:w="100"/>
-              <w:left w:type="dxa" w:w="120"/>
-              <w:bottom w:type="dxa" w:w="100"/>
-              <w:right w:type="dxa" w:w="120"/>
-            </w:tcMar>
-          </w:tcPr>
-          <w:p>
-            <w:r>
-              <w:rPr>
-                <w:rFonts w:ascii="Arial" w:cs="Arial" w:eastAsia="Arial" w:hAnsi="Arial"/>
-                <w:sz w:val="20"/>
-                <w:szCs w:val="20"/>
-              </w:rPr>
-              <w:t xml:space="preserve">Direct REST call to LIS</w:t>
-            </w:r>
-          </w:p>
-        </w:tc>
-      </w:tr>
-      <w:tr>
-        <w:tc>
-          <w:tcPr>
-            <w:tcW w:type="dxa" w:w="2000"/>
-            <w:tcBorders>
-              <w:top w:val="single" w:color="D1D5DB" w:sz="1"/>
-              <w:left w:val="single" w:color="D1D5DB" w:sz="1"/>
-              <w:bottom w:val="single" w:color="D1D5DB" w:sz="1"/>
-              <w:right w:val="single" w:color="D1D5DB" w:sz="1"/>
-            </w:tcBorders>
-            <w:shd w:fill="F8FAFC" w:val="clear"/>
-            <w:tcMar>
-              <w:top w:type="dxa" w:w="100"/>
-              <w:left w:type="dxa" w:w="120"/>
-              <w:bottom w:type="dxa" w:w="100"/>
-              <w:right w:type="dxa" w:w="120"/>
-            </w:tcMar>
-          </w:tcPr>
-          <w:p>
-            <w:r>
-              <w:rPr>
-                <w:rFonts w:ascii="Arial" w:cs="Arial" w:eastAsia="Arial" w:hAnsi="Arial"/>
-                <w:sz w:val="20"/>
-                <w:szCs w:val="20"/>
-              </w:rPr>
-              <w:t xml:space="preserve">ai-extract</w:t>
-            </w:r>
-          </w:p>
-        </w:tc>
-        <w:tc>
-          <w:tcPr>
-            <w:tcW w:type="dxa" w:w="3000"/>
-            <w:tcBorders>
-              <w:top w:val="single" w:color="D1D5DB" w:sz="1"/>
-              <w:left w:val="single" w:color="D1D5DB" w:sz="1"/>
-              <w:bottom w:val="single" w:color="D1D5DB" w:sz="1"/>
-              <w:right w:val="single" w:color="D1D5DB" w:sz="1"/>
-            </w:tcBorders>
-            <w:shd w:fill="F8FAFC" w:val="clear"/>
-            <w:tcMar>
-              <w:top w:type="dxa" w:w="100"/>
-              <w:left w:type="dxa" w:w="120"/>
-              <w:bottom w:type="dxa" w:w="100"/>
-              <w:right w:type="dxa" w:w="120"/>
-            </w:tcMar>
-          </w:tcPr>
-          <w:p>
-            <w:r>
-              <w:rPr>
-                <w:rFonts w:ascii="Arial" w:cs="Arial" w:eastAsia="Arial" w:hAnsi="Arial"/>
-                <w:sz w:val="20"/>
-                <w:szCs w:val="20"/>
-              </w:rPr>
-              <w:t xml:space="preserve">Yes (proxy)</w:t>
-            </w:r>
-          </w:p>
-        </w:tc>
-        <w:tc>
-          <w:tcPr>
-            <w:tcW w:type="dxa" w:w="4360"/>
-            <w:tcBorders>
-              <w:top w:val="single" w:color="D1D5DB" w:sz="1"/>
-              <w:left w:val="single" w:color="D1D5DB" w:sz="1"/>
-              <w:bottom w:val="single" w:color="D1D5DB" w:sz="1"/>
-              <w:right w:val="single" w:color="D1D5DB" w:sz="1"/>
-            </w:tcBorders>
-            <w:shd w:fill="F8FAFC" w:val="clear"/>
-            <w:tcMar>
-              <w:top w:type="dxa" w:w="100"/>
-              <w:left w:type="dxa" w:w="120"/>
-              <w:bottom w:type="dxa" w:w="100"/>
-              <w:right w:type="dxa" w:w="120"/>
-            </w:tcMar>
-          </w:tcPr>
-          <w:p>
-            <w:r>
-              <w:rPr>
-                <w:rFonts w:ascii="Arial" w:cs="Arial" w:eastAsia="Arial" w:hAnsi="Arial"/>
-                <w:sz w:val="20"/>
-                <w:szCs w:val="20"/>
-              </w:rPr>
-              <w:t xml:space="preserve">AI proxy parses unstructured LIS text</w:t>
-            </w:r>
-          </w:p>
-        </w:tc>
-      </w:tr>
-      <w:tr>
-        <w:tc>
-          <w:tcPr>
-            <w:tcW w:type="dxa" w:w="2000"/>
-            <w:tcBorders>
-              <w:top w:val="single" w:color="D1D5DB" w:sz="1"/>
-              <w:left w:val="single" w:color="D1D5DB" w:sz="1"/>
-              <w:bottom w:val="single" w:color="D1D5DB" w:sz="1"/>
-              <w:right w:val="single" w:color="D1D5DB" w:sz="1"/>
-            </w:tcBorders>
-            <w:tcMar>
-              <w:top w:type="dxa" w:w="100"/>
-              <w:left w:type="dxa" w:w="120"/>
-              <w:bottom w:type="dxa" w:w="100"/>
-              <w:right w:type="dxa" w:w="120"/>
-            </w:tcMar>
-          </w:tcPr>
-          <w:p>
-            <w:r>
-              <w:rPr>
-                <w:rFonts w:ascii="Arial" w:cs="Arial" w:eastAsia="Arial" w:hAnsi="Arial"/>
-                <w:sz w:val="20"/>
-                <w:szCs w:val="20"/>
-              </w:rPr>
-              <w:t xml:space="preserve">pathscribe</w:t>
-            </w:r>
-          </w:p>
-        </w:tc>
-        <w:tc>
-          <w:tcPr>
-            <w:tcW w:type="dxa" w:w="3000"/>
-            <w:tcBorders>
-              <w:top w:val="single" w:color="D1D5DB" w:sz="1"/>
-              <w:left w:val="single" w:color="D1D5DB" w:sz="1"/>
-              <w:bottom w:val="single" w:color="D1D5DB" w:sz="1"/>
-              <w:right w:val="single" w:color="D1D5DB" w:sz="1"/>
-            </w:tcBorders>
-            <w:tcMar>
-              <w:top w:type="dxa" w:w="100"/>
-              <w:left w:type="dxa" w:w="120"/>
-              <w:bottom w:type="dxa" w:w="100"/>
-              <w:right w:type="dxa" w:w="120"/>
-            </w:tcMar>
-          </w:tcPr>
-          <w:p>
-            <w:r>
-              <w:rPr>
-                <w:rFonts w:ascii="Arial" w:cs="Arial" w:eastAsia="Arial" w:hAnsi="Arial"/>
-                <w:sz w:val="20"/>
-                <w:szCs w:val="20"/>
-              </w:rPr>
-              <w:t xml:space="preserve">No</w:t>
-            </w:r>
-          </w:p>
-        </w:tc>
-        <w:tc>
-          <w:tcPr>
-            <w:tcW w:type="dxa" w:w="4360"/>
-            <w:tcBorders>
-              <w:top w:val="single" w:color="D1D5DB" w:sz="1"/>
-              <w:left w:val="single" w:color="D1D5DB" w:sz="1"/>
-              <w:bottom w:val="single" w:color="D1D5DB" w:sz="1"/>
-              <w:right w:val="single" w:color="D1D5DB" w:sz="1"/>
-            </w:tcBorders>
-            <w:tcMar>
-              <w:top w:type="dxa" w:w="100"/>
-              <w:left w:type="dxa" w:w="120"/>
-              <w:bottom w:type="dxa" w:w="100"/>
-              <w:right w:type="dxa" w:w="120"/>
-            </w:tcMar>
-          </w:tcPr>
-          <w:p>
-            <w:r>
-              <w:rPr>
-                <w:rFonts w:ascii="Arial" w:cs="Arial" w:eastAsia="Arial" w:hAnsi="Arial"/>
-                <w:sz w:val="20"/>
-                <w:szCs w:val="20"/>
-              </w:rPr>
-              <w:t xml:space="preserve">Result captured in synoptic checklist</w:t>
-            </w:r>
-          </w:p>
-        </w:tc>
-      </w:tr>
-    </w:tbl>
+        <w:t xml:space="preserve">2.3 Order Workflow (v1.2 — corrected)</w:t>
+      </w:r>
+    </w:p>
+    <w:p>
+      <w:pPr>
+        <w:spacing w:after="80" w:before="80"/>
+      </w:pPr>
+      <w:r>
+        <w:rPr>
+          <w:rFonts w:ascii="Arial" w:cs="Arial" w:eastAsia="Arial" w:hAnsi="Arial"/>
+          <w:sz w:val="22"/>
+          <w:szCs w:val="22"/>
+        </w:rPr>
+        <w:t xml:space="preserve">flagService.add() is NOT called during ordering. Orders are persisted only via caseService.updateCase(), which appends to caseData.specimenFlags. This prevents duplicate flag definitions in the flag catalog.</w:t>
+      </w:r>
+    </w:p>
+    <w:p>
+      <w:pPr>
+        <w:spacing w:after="80" w:before="80"/>
+      </w:pPr>
+      <w:r>
+        <w:t xml:space="preserve"/>
+      </w:r>
+    </w:p>
+    <w:p>
+      <w:pPr>
+        <w:spacing w:after="60" w:before="60"/>
+        <w:ind w:left="720"/>
+      </w:pPr>
+      <w:r>
+        <w:rPr>
+          <w:rFonts w:ascii="Courier New" w:cs="Courier New" w:eastAsia="Courier New" w:hAnsi="Courier New"/>
+          <w:color w:val="374151"/>
+          <w:sz w:val="18"/>
+          <w:szCs w:val="18"/>
+        </w:rPr>
+        <w:t xml:space="preserve">1. "Order additional test" → modal opens</w:t>
+      </w:r>
+    </w:p>
+    <w:p>
+      <w:pPr>
+        <w:spacing w:after="60" w:before="60"/>
+        <w:ind w:left="720"/>
+      </w:pPr>
+      <w:r>
+        <w:rPr>
+          <w:rFonts w:ascii="Courier New" w:cs="Courier New" w:eastAsia="Courier New" w:hAnsi="Courier New"/>
+          <w:color w:val="374151"/>
+          <w:sz w:val="18"/>
+          <w:szCs w:val="18"/>
+        </w:rPr>
+        <w:t xml:space="preserve">2. Pathologist selects specimen target + stages tests (togglePendingOrder)</w:t>
+      </w:r>
+    </w:p>
+    <w:p>
+      <w:pPr>
+        <w:spacing w:after="60" w:before="60"/>
+        <w:ind w:left="720"/>
+      </w:pPr>
+      <w:r>
+        <w:rPr>
+          <w:rFonts w:ascii="Courier New" w:cs="Courier New" w:eastAsia="Courier New" w:hAnsi="Courier New"/>
+          <w:color w:val="374151"/>
+          <w:sz w:val="18"/>
+          <w:szCs w:val="18"/>
+        </w:rPr>
+        <w:t xml:space="preserve">3. "Place Orders" → for each staged order:</w:t>
+      </w:r>
+    </w:p>
+    <w:p>
+      <w:pPr>
+        <w:spacing w:after="60" w:before="60"/>
+        <w:ind w:left="720"/>
+      </w:pPr>
+      <w:r>
+        <w:rPr>
+          <w:rFonts w:ascii="Courier New" w:cs="Courier New" w:eastAsia="Courier New" w:hAnsi="Courier New"/>
+          <w:color w:val="374151"/>
+          <w:sz w:val="18"/>
+          <w:szCs w:val="18"/>
+        </w:rPr>
+        <w:t xml:space="preserve">   - messageService.send() — lab notification (non-blocking)</w:t>
+      </w:r>
+    </w:p>
+    <w:p>
+      <w:pPr>
+        <w:spacing w:after="60" w:before="60"/>
+        <w:ind w:left="720"/>
+      </w:pPr>
+      <w:r>
+        <w:rPr>
+          <w:rFonts w:ascii="Courier New" w:cs="Courier New" w:eastAsia="Courier New" w:hAnsi="Courier New"/>
+          <w:color w:val="374151"/>
+          <w:sz w:val="18"/>
+          <w:szCs w:val="18"/>
+        </w:rPr>
+        <w:t xml:space="preserve">   - ps:suggest-protocols event → Add Synoptic pre-filtered</w:t>
+      </w:r>
+    </w:p>
+    <w:p>
+      <w:pPr>
+        <w:spacing w:after="60" w:before="60"/>
+        <w:ind w:left="720"/>
+      </w:pPr>
+      <w:r>
+        <w:rPr>
+          <w:rFonts w:ascii="Courier New" w:cs="Courier New" w:eastAsia="Courier New" w:hAnsi="Courier New"/>
+          <w:color w:val="374151"/>
+          <w:sz w:val="18"/>
+          <w:szCs w:val="18"/>
+        </w:rPr>
+        <w:t xml:space="preserve">4. caseService.updateCase(caseId, { specimenFlags: merged })</w:t>
+      </w:r>
+    </w:p>
+    <w:p>
+      <w:pPr>
+        <w:spacing w:after="60" w:before="60"/>
+        <w:ind w:left="720"/>
+      </w:pPr>
+      <w:r>
+        <w:rPr>
+          <w:rFonts w:ascii="Courier New" w:cs="Courier New" w:eastAsia="Courier New" w:hAnsi="Courier New"/>
+          <w:color w:val="374151"/>
+          <w:sz w:val="18"/>
+          <w:szCs w:val="18"/>
+        </w:rPr>
+        <w:t xml:space="preserve">   - Merged = existing entries updated by lisCode (upsert, not append)</w:t>
+      </w:r>
+    </w:p>
+    <w:p>
+      <w:pPr>
+        <w:spacing w:after="60" w:before="60"/>
+        <w:ind w:left="720"/>
+      </w:pPr>
+      <w:r>
+        <w:rPr>
+          <w:rFonts w:ascii="Courier New" w:cs="Courier New" w:eastAsia="Courier New" w:hAnsi="Courier New"/>
+          <w:color w:val="374151"/>
+          <w:sz w:val="18"/>
+          <w:szCs w:val="18"/>
+        </w:rPr>
+        <w:t xml:space="preserve">5. onFlagsChanged() → refreshCompFlags() re-fetches flags + caseData</w:t>
+      </w:r>
+    </w:p>
     <w:p>
       <w:pPr>
         <w:spacing w:after="80" w:before="80"/>
@@ -919,7 +671,7 @@
           <w:sz w:val="26"/>
           <w:szCs w:val="26"/>
         </w:rPr>
-        <w:t xml:space="preserve">2.4 Order Workflow</w:t>
+        <w:t xml:space="preserve">2.4 Cancel Workflow (v1.2 — corrected)</w:t>
       </w:r>
     </w:p>
     <w:p>
@@ -932,115 +684,90 @@
           <w:sz w:val="22"/>
           <w:szCs w:val="22"/>
         </w:rPr>
-        <w:t xml:space="preserve">Orders placed via the Computational panel follow a multi-step staging pattern matching the Flag Manager:</w:t>
-      </w:r>
-    </w:p>
-    <w:p>
-      <w:pPr>
-        <w:pStyle w:val="ListParagraph"/>
-        <w:numPr>
-          <w:ilvl w:val="0"/>
-          <w:numId w:val="2"/>
-        </w:numPr>
-        <w:spacing w:after="40" w:before="40"/>
-      </w:pPr>
-      <w:r>
-        <w:rPr>
-          <w:rFonts w:ascii="Arial" w:cs="Arial" w:eastAsia="Arial" w:hAnsi="Arial"/>
-          <w:sz w:val="22"/>
-          <w:szCs w:val="22"/>
-        </w:rPr>
-        <w:t xml:space="preserve">Pathologist opens "Order Additional Test" modal</w:t>
-      </w:r>
-    </w:p>
-    <w:p>
-      <w:pPr>
-        <w:pStyle w:val="ListParagraph"/>
-        <w:numPr>
-          <w:ilvl w:val="0"/>
-          <w:numId w:val="2"/>
-        </w:numPr>
-        <w:spacing w:after="40" w:before="40"/>
-      </w:pPr>
-      <w:r>
-        <w:rPr>
-          <w:rFonts w:ascii="Arial" w:cs="Arial" w:eastAsia="Arial" w:hAnsi="Arial"/>
-          <w:sz w:val="22"/>
-          <w:szCs w:val="22"/>
-        </w:rPr>
-        <w:t xml:space="preserve">Selects specimen target (All Specimens or specific specimen)</w:t>
-      </w:r>
-    </w:p>
-    <w:p>
-      <w:pPr>
-        <w:pStyle w:val="ListParagraph"/>
-        <w:numPr>
-          <w:ilvl w:val="0"/>
-          <w:numId w:val="2"/>
-        </w:numPr>
-        <w:spacing w:after="40" w:before="40"/>
-      </w:pPr>
-      <w:r>
-        <w:rPr>
-          <w:rFonts w:ascii="Arial" w:cs="Arial" w:eastAsia="Arial" w:hAnsi="Arial"/>
-          <w:sz w:val="22"/>
-          <w:szCs w:val="22"/>
-        </w:rPr>
-        <w:t xml:space="preserve">Stages one or more tests — pending orders accumulate in the left panel with trash icon for removal</w:t>
-      </w:r>
-    </w:p>
-    <w:p>
-      <w:pPr>
-        <w:pStyle w:val="ListParagraph"/>
-        <w:numPr>
-          <w:ilvl w:val="0"/>
-          <w:numId w:val="2"/>
-        </w:numPr>
-        <w:spacing w:after="40" w:before="40"/>
-      </w:pPr>
-      <w:r>
-        <w:rPr>
-          <w:rFonts w:ascii="Arial" w:cs="Arial" w:eastAsia="Arial" w:hAnsi="Arial"/>
-          <w:sz w:val="22"/>
-          <w:szCs w:val="22"/>
-        </w:rPr>
-        <w:t xml:space="preserve">"Place Orders" submits all staged orders in sequence</w:t>
-      </w:r>
-    </w:p>
-    <w:p>
-      <w:pPr>
-        <w:pStyle w:val="ListParagraph"/>
-        <w:numPr>
-          <w:ilvl w:val="0"/>
-          <w:numId w:val="2"/>
-        </w:numPr>
-        <w:spacing w:after="40" w:before="40"/>
-      </w:pPr>
-      <w:r>
-        <w:rPr>
-          <w:rFonts w:ascii="Arial" w:cs="Arial" w:eastAsia="Arial" w:hAnsi="Arial"/>
-          <w:sz w:val="22"/>
-          <w:szCs w:val="22"/>
-        </w:rPr>
-        <w:t xml:space="preserve">Each order: flagService.add() + messageService.send() + ps:suggest-protocols event</w:t>
-      </w:r>
-    </w:p>
-    <w:p>
-      <w:pPr>
-        <w:pStyle w:val="ListParagraph"/>
-        <w:numPr>
-          <w:ilvl w:val="0"/>
-          <w:numId w:val="2"/>
-        </w:numPr>
-        <w:spacing w:after="40" w:before="40"/>
-      </w:pPr>
-      <w:r>
-        <w:rPr>
-          <w:rFonts w:ascii="Arial" w:cs="Arial" w:eastAsia="Arial" w:hAnsi="Arial"/>
-          <w:sz w:val="22"/>
-          <w:szCs w:val="22"/>
-        </w:rPr>
-        <w:t xml:space="preserve">orderedVia: "pathscribe" tagged on all PathScribe-originated orders</w:t>
+        <w:t xml:space="preserve">Cancellation filters caseData.specimenFlags by lisCode (not id). The id-based filter was silently failing because seed entry IDs (e.g. comp-mol-4402) never matched catalog flag IDs.</w:t>
+      </w:r>
+    </w:p>
+    <w:p>
+      <w:pPr>
+        <w:spacing w:after="80" w:before="80"/>
+      </w:pPr>
+      <w:r>
+        <w:t xml:space="preserve"/>
+      </w:r>
+    </w:p>
+    <w:p>
+      <w:pPr>
+        <w:spacing w:after="60" w:before="60"/>
+        <w:ind w:left="720"/>
+      </w:pPr>
+      <w:r>
+        <w:rPr>
+          <w:rFonts w:ascii="Courier New" w:cs="Courier New" w:eastAsia="Courier New" w:hAnsi="Courier New"/>
+          <w:color w:val="374151"/>
+          <w:sz w:val="18"/>
+          <w:szCs w:val="18"/>
+        </w:rPr>
+        <w:t xml:space="preserve">1. Trash icon → setCancelTarget(flag)</w:t>
+      </w:r>
+    </w:p>
+    <w:p>
+      <w:pPr>
+        <w:spacing w:after="60" w:before="60"/>
+        <w:ind w:left="720"/>
+      </w:pPr>
+      <w:r>
+        <w:rPr>
+          <w:rFonts w:ascii="Courier New" w:cs="Courier New" w:eastAsia="Courier New" w:hAnsi="Courier New"/>
+          <w:color w:val="374151"/>
+          <w:sz w:val="18"/>
+          <w:szCs w:val="18"/>
+        </w:rPr>
+        <w:t xml:space="preserve">2. Modal shows — orderedVia determines messaging variant</w:t>
+      </w:r>
+    </w:p>
+    <w:p>
+      <w:pPr>
+        <w:spacing w:after="60" w:before="60"/>
+        <w:ind w:left="720"/>
+      </w:pPr>
+      <w:r>
+        <w:rPr>
+          <w:rFonts w:ascii="Courier New" w:cs="Courier New" w:eastAsia="Courier New" w:hAnsi="Courier New"/>
+          <w:color w:val="374151"/>
+          <w:sz w:val="18"/>
+          <w:szCs w:val="18"/>
+        </w:rPr>
+        <w:t xml:space="preserve">3. Confirm → messageService.send(cancel)</w:t>
+      </w:r>
+    </w:p>
+    <w:p>
+      <w:pPr>
+        <w:spacing w:after="60" w:before="60"/>
+        <w:ind w:left="720"/>
+      </w:pPr>
+      <w:r>
+        <w:rPr>
+          <w:rFonts w:ascii="Courier New" w:cs="Courier New" w:eastAsia="Courier New" w:hAnsi="Courier New"/>
+          <w:color w:val="374151"/>
+          <w:sz w:val="18"/>
+          <w:szCs w:val="18"/>
+        </w:rPr>
+        <w:t xml:space="preserve">4. caseService.updateCase: specimenFlags filtered by f.lisCode !== cancelTarget.lisCode</w:t>
+      </w:r>
+    </w:p>
+    <w:p>
+      <w:pPr>
+        <w:spacing w:after="60" w:before="60"/>
+        <w:ind w:left="720"/>
+      </w:pPr>
+      <w:r>
+        <w:rPr>
+          <w:rFonts w:ascii="Courier New" w:cs="Courier New" w:eastAsia="Courier New" w:hAnsi="Courier New"/>
+          <w:color w:val="374151"/>
+          <w:sz w:val="18"/>
+          <w:szCs w:val="18"/>
+        </w:rPr>
+        <w:t xml:space="preserve">5. onFlagsChanged() → refreshCompFlags()</w:t>
       </w:r>
     </w:p>
     <w:p>
@@ -1065,7 +792,7 @@
           <w:sz w:val="26"/>
           <w:szCs w:val="26"/>
         </w:rPr>
-        <w:t xml:space="preserve">2.5 Order Cancellation</w:t>
+        <w:t xml:space="preserve">2.5 Specimen Assignment</w:t>
       </w:r>
     </w:p>
     <w:p>
@@ -1078,17 +805,20 @@
           <w:sz w:val="22"/>
           <w:szCs w:val="22"/>
         </w:rPr>
-        <w:t xml:space="preserve">Trash icon appears only on Pending flags (no result received). Two cancellation paths:</w:t>
-      </w:r>
-    </w:p>
-    <w:p>
-      <w:pPr>
-        <w:pStyle w:val="ListParagraph"/>
-        <w:numPr>
-          <w:ilvl w:val="0"/>
-          <w:numId w:val="2"/>
-        </w:numPr>
-        <w:spacing w:after="40" w:before="40"/>
+        <w:t xml:space="preserve">caseComputationalFlags in SynopticReportPage enriches flag definitions with specimenId from caseData.specimenFlags via a lisCodeToSpecimenId map. This is the authoritative source of specimen assignment — flag catalog definitions do not carry specimenId.</w:t>
+      </w:r>
+    </w:p>
+    <w:p>
+      <w:pPr>
+        <w:spacing w:after="80" w:before="80"/>
+      </w:pPr>
+      <w:r>
+        <w:t xml:space="preserve"/>
+      </w:r>
+    </w:p>
+    <w:p>
+      <w:pPr>
+        <w:spacing w:after="80" w:before="80"/>
       </w:pPr>
       <w:r>
         <w:rPr>
@@ -1096,38 +826,7 @@
           <w:sz w:val="22"/>
           <w:szCs w:val="22"/>
         </w:rPr>
-        <w:t xml:space="preserve">orderedVia: "pathscribe" — lab notified, flag removed, clean workflow</w:t>
-      </w:r>
-    </w:p>
-    <w:p>
-      <w:pPr>
-        <w:pStyle w:val="ListParagraph"/>
-        <w:numPr>
-          <w:ilvl w:val="0"/>
-          <w:numId w:val="2"/>
-        </w:numPr>
-        <w:spacing w:after="40" w:before="40"/>
-      </w:pPr>
-      <w:r>
-        <w:rPr>
-          <w:rFonts w:ascii="Arial" w:cs="Arial" w:eastAsia="Arial" w:hAnsi="Arial"/>
-          <w:sz w:val="22"/>
-          <w:szCs w:val="22"/>
-        </w:rPr>
-        <w:t xml:space="preserve">orderedVia: "lis" — amber warning: "must also cancel in your LIS system", lab notified, flag removed</w:t>
-      </w:r>
-    </w:p>
-    <w:p>
-      <w:pPr>
-        <w:spacing w:after="80" w:before="80"/>
-      </w:pPr>
-      <w:r>
-        <w:rPr>
-          <w:rFonts w:ascii="Arial" w:cs="Arial" w:eastAsia="Arial" w:hAnsi="Arial"/>
-          <w:sz w:val="22"/>
-          <w:szCs w:val="22"/>
-        </w:rPr>
-        <w:t xml:space="preserve">orderedVia defaults to "lis" if absent — existing seed flags are all LIS-originated.</w:t>
+        <w:t xml:space="preserve">Processing order in collectAssignment: caseFlags (overwrite=false), then specimenFlags (overwrite=true). This ensures specimenFlags always wins.</w:t>
       </w:r>
     </w:p>
     <w:p>
@@ -1152,7 +851,7 @@
           <w:sz w:val="26"/>
           <w:szCs w:val="26"/>
         </w:rPr>
-        <w:t xml:space="preserve">2.6 Specimen Assignment</w:t>
+        <w:t xml:space="preserve">2.6 refreshCompFlags</w:t>
       </w:r>
     </w:p>
     <w:p>
@@ -1165,7 +864,7 @@
           <w:sz w:val="22"/>
           <w:szCs w:val="22"/>
         </w:rPr>
-        <w:t xml:space="preserve">Applied computational flags now carry specimenId pointing to the specific specimen the test was ordered for. The Order modal left panel mirrors the Flag Manager specimen selector. SidecarDisplay shows a specimen badge in the result header.</w:t>
+        <w:t xml:space="preserve">Extracted as useCallback at component level in SynopticReportPage. Called on mount and after every order/cancel. Performs: flagService.getAll() with lisCode deduplication, mockCaseService.getCase() to refresh specimenFlags, resultService batch fetch for AI prompt.</w:t>
       </w:r>
     </w:p>
     <w:p>
@@ -1190,7 +889,7 @@
           <w:sz w:val="26"/>
           <w:szCs w:val="26"/>
         </w:rPr>
-        <w:t xml:space="preserve">2.7 ComputationalPanel vs SidecarDrawer</w:t>
+        <w:t xml:space="preserve">2.7 Navigator Grouping</w:t>
       </w:r>
     </w:p>
     <w:p>
@@ -1203,7 +902,45 @@
           <w:sz w:val="22"/>
           <w:szCs w:val="22"/>
         </w:rPr>
-        <w:t xml:space="preserve">ComputationalPanel (synoptic tab) is context-independent — it owns its own inline navigator with the trash icon and order button. SidecarDrawer (worklist overlay) uses its own 200px fixed-width navigator container. SidecarNavigator remains generic and fills its container.</w:t>
+        <w:t xml:space="preserve">Both SidecarDrawer and ComputationalPanel use identical grouped inline navigators — no longer using SidecarNavigator in the drawer. Structure: Case level section, then each specimen in order, with count badges and flags listed underneath. Trash icons on Pending flags only.</w:t>
+      </w:r>
+    </w:p>
+    <w:p>
+      <w:pPr>
+        <w:spacing w:after="80" w:before="80"/>
+      </w:pPr>
+      <w:r>
+        <w:t xml:space="preserve"/>
+      </w:r>
+    </w:p>
+    <w:p>
+      <w:pPr>
+        <w:pStyle w:val="Heading2"/>
+        <w:spacing w:after="120" w:before="300"/>
+      </w:pPr>
+      <w:r>
+        <w:rPr>
+          <w:rFonts w:ascii="Arial" w:cs="Arial" w:eastAsia="Arial" w:hAnsi="Arial"/>
+          <w:b/>
+          <w:bCs/>
+          <w:color w:val="0891B2"/>
+          <w:sz w:val="26"/>
+          <w:szCs w:val="26"/>
+        </w:rPr>
+        <w:t xml:space="preserve">2.8 WCAG 2.1 AA Compliance</w:t>
+      </w:r>
+    </w:p>
+    <w:p>
+      <w:pPr>
+        <w:spacing w:after="80" w:before="80"/>
+      </w:pPr>
+      <w:r>
+        <w:rPr>
+          <w:rFonts w:ascii="Arial" w:cs="Arial" w:eastAsia="Arial" w:hAnsi="Arial"/>
+          <w:sz w:val="22"/>
+          <w:szCs w:val="22"/>
+        </w:rPr>
+        <w:t xml:space="preserve">All new modals have role="dialog", aria-modal="true", aria-labelledby. Focus trapped via useFocusTrap hook. Interactive divs replaced with button elements. Navigator uses role="listbox" with role="option" and aria-selected. Arrow key navigation on flag rows. Hidden radio inputs use .ps-radio-hidden (visually hidden, keyboard accessible). All icon buttons have aria-label.</w:t>
       </w:r>
     </w:p>
     <w:p>
@@ -1228,24 +965,7 @@
           <w:sz w:val="32"/>
           <w:szCs w:val="32"/>
         </w:rPr>
-        <w:t xml:space="preserve">3. File Inventory</w:t>
-      </w:r>
-    </w:p>
-    <w:p>
-      <w:pPr>
-        <w:pStyle w:val="Heading2"/>
-        <w:spacing w:after="120" w:before="300"/>
-      </w:pPr>
-      <w:r>
-        <w:rPr>
-          <w:rFonts w:ascii="Arial" w:cs="Arial" w:eastAsia="Arial" w:hAnsi="Arial"/>
-          <w:b/>
-          <w:bCs/>
-          <w:color w:val="0891B2"/>
-          <w:sz w:val="26"/>
-          <w:szCs w:val="26"/>
-        </w:rPr>
-        <w:t xml:space="preserve">New Files</w:t>
+        <w:t xml:space="preserve">3. New Files</w:t>
       </w:r>
     </w:p>
     <w:tbl>
@@ -1355,7 +1075,7 @@
                 <w:sz w:val="20"/>
                 <w:szCs w:val="20"/>
               </w:rPr>
-              <w:t xml:space="preserve">src/types/smarttag.types.ts</w:t>
+              <w:t xml:space="preserve">src/hooks/useFocusTrap.ts</w:t>
             </w:r>
           </w:p>
         </w:tc>
@@ -1382,7 +1102,7 @@
                 <w:sz w:val="20"/>
                 <w:szCs w:val="20"/>
               </w:rPr>
-              <w:t xml:space="preserve">ComputationalResult, ResultStatus, ActionabilityLevel, DataSourceType</w:t>
+              <w:t xml:space="preserve">Focus trap hook — used by all modals. Cycles Tab/Shift+Tab within container, restores focus on close.</w:t>
             </w:r>
           </w:p>
         </w:tc>
@@ -1412,7 +1132,7 @@
                 <w:sz w:val="20"/>
                 <w:szCs w:val="20"/>
               </w:rPr>
-              <w:t xml:space="preserve">src/services/flags/IFlagService.ts</w:t>
+              <w:t xml:space="preserve">src/constants/computationalActions.ts</w:t>
             </w:r>
           </w:p>
         </w:tc>
@@ -1440,7 +1160,7 @@
                 <w:sz w:val="20"/>
                 <w:szCs w:val="20"/>
               </w:rPr>
-              <w:t xml:space="preserve">Extended Flag with tagClass, dataSourceType, synopticFieldIds, defaultProtocolIds</w:t>
+              <w:t xml:space="preserve">COMP_EVENT, COMP_VOICE, COMP_AUDIT constants for voice registry and audit</w:t>
             </w:r>
           </w:p>
         </w:tc>
@@ -1469,7 +1189,7 @@
                 <w:sz w:val="20"/>
                 <w:szCs w:val="20"/>
               </w:rPr>
-              <w:t xml:space="preserve">src/services/result/IResultService.ts</w:t>
+              <w:t xml:space="preserve">src/types/smarttag.types.ts</w:t>
             </w:r>
           </w:p>
         </w:tc>
@@ -1496,7 +1216,7 @@
                 <w:sz w:val="20"/>
                 <w:szCs w:val="20"/>
               </w:rPr>
-              <w:t xml:space="preserve">Result service interface</w:t>
+              <w:t xml:space="preserve">ComputationalResult, ResultStatus, ActionabilityLevel, DataSourceType</w:t>
             </w:r>
           </w:p>
         </w:tc>
@@ -1526,7 +1246,7 @@
                 <w:sz w:val="20"/>
                 <w:szCs w:val="20"/>
               </w:rPr>
-              <w:t xml:space="preserve">src/services/result/MockResultService.ts</w:t>
+              <w:t xml:space="preserve">src/services/result/IResultService.ts</w:t>
             </w:r>
           </w:p>
         </w:tc>
@@ -1554,7 +1274,7 @@
                 <w:sz w:val="20"/>
                 <w:szCs w:val="20"/>
               </w:rPr>
-              <w:t xml:space="preserve">20+ synthetic results (keys: sourceId_caseId)</w:t>
+              <w:t xml:space="preserve">Result service interface</w:t>
             </w:r>
           </w:p>
         </w:tc>
@@ -1583,7 +1303,7 @@
                 <w:sz w:val="20"/>
                 <w:szCs w:val="20"/>
               </w:rPr>
-              <w:t xml:space="preserve">src/services/result/FirestoreResultService.ts</w:t>
+              <w:t xml:space="preserve">src/services/result/MockResultService.ts</w:t>
             </w:r>
           </w:p>
         </w:tc>
@@ -1610,7 +1330,7 @@
                 <w:sz w:val="20"/>
                 <w:szCs w:val="20"/>
               </w:rPr>
-              <w:t xml:space="preserve">Production result fetcher</w:t>
+              <w:t xml:space="preserve">20+ synthetic results</w:t>
             </w:r>
           </w:p>
         </w:tc>
@@ -1640,7 +1360,7 @@
                 <w:sz w:val="20"/>
                 <w:szCs w:val="20"/>
               </w:rPr>
-              <w:t xml:space="preserve">src/components/flags/flagIcons.tsx</w:t>
+              <w:t xml:space="preserve">src/services/result/FirestoreResultService.ts</w:t>
             </w:r>
           </w:p>
         </w:tc>
@@ -1668,7 +1388,7 @@
                 <w:sz w:val="20"/>
                 <w:szCs w:val="20"/>
               </w:rPr>
-              <w:t xml:space="preserve">SVG glyphs: ihc, fish, molecular, flow-cytometry, cytogenetics, micro, coag, generic-lab</w:t>
+              <w:t xml:space="preserve">Production result fetcher</w:t>
             </w:r>
           </w:p>
         </w:tc>
@@ -1697,7 +1417,7 @@
                 <w:sz w:val="20"/>
                 <w:szCs w:val="20"/>
               </w:rPr>
-              <w:t xml:space="preserve">src/components/flags/ComputationalFlagIcon.tsx</w:t>
+              <w:t xml:space="preserve">src/components/flags/flagIcons.tsx</w:t>
             </w:r>
           </w:p>
         </w:tc>
@@ -1724,7 +1444,7 @@
                 <w:sz w:val="20"/>
                 <w:szCs w:val="20"/>
               </w:rPr>
-              <w:t xml:space="preserve">Worklist icon state machine</w:t>
+              <w:t xml:space="preserve">SVG glyphs: ihc, fish, molecular, flow-cytometry, cytogenetics, micro, coag, generic-lab</w:t>
             </w:r>
           </w:p>
         </w:tc>
@@ -1754,7 +1474,7 @@
                 <w:sz w:val="20"/>
                 <w:szCs w:val="20"/>
               </w:rPr>
-              <w:t xml:space="preserve">src/contexts/SidecarContext.tsx</w:t>
+              <w:t xml:space="preserve">src/components/flags/ComputationalFlagIcon.tsx</w:t>
             </w:r>
           </w:p>
         </w:tc>
@@ -1782,7 +1502,7 @@
                 <w:sz w:val="20"/>
                 <w:szCs w:val="20"/>
               </w:rPr>
-              <w:t xml:space="preserve">Drawer state across routes</w:t>
+              <w:t xml:space="preserve">Worklist icon state machine</w:t>
             </w:r>
           </w:p>
         </w:tc>
@@ -1811,7 +1531,7 @@
                 <w:sz w:val="20"/>
                 <w:szCs w:val="20"/>
               </w:rPr>
-              <w:t xml:space="preserve">src/components/sidecar/SidecarDrawer.tsx</w:t>
+              <w:t xml:space="preserve">src/contexts/SidecarContext.tsx</w:t>
             </w:r>
           </w:p>
         </w:tc>
@@ -1838,7 +1558,7 @@
                 <w:sz w:val="20"/>
                 <w:szCs w:val="20"/>
               </w:rPr>
-              <w:t xml:space="preserve">Overlay drawer — worklist</w:t>
+              <w:t xml:space="preserve">Drawer state across routes</w:t>
             </w:r>
           </w:p>
         </w:tc>
@@ -1868,7 +1588,7 @@
                 <w:sz w:val="20"/>
                 <w:szCs w:val="20"/>
               </w:rPr>
-              <w:t xml:space="preserve">src/components/sidecar/SidecarNavigator.tsx</w:t>
+              <w:t xml:space="preserve">src/components/sidecar/SidecarDrawer.tsx</w:t>
             </w:r>
           </w:p>
         </w:tc>
@@ -1896,7 +1616,7 @@
                 <w:sz w:val="20"/>
                 <w:szCs w:val="20"/>
               </w:rPr>
-              <w:t xml:space="preserve">Generic navigator pane (width: 100%, fills container)</w:t>
+              <w:t xml:space="preserve">Overlay drawer — worklist. Grouped navigator with specimen sections.</w:t>
             </w:r>
           </w:p>
         </w:tc>
@@ -1925,7 +1645,7 @@
                 <w:sz w:val="20"/>
                 <w:szCs w:val="20"/>
               </w:rPr>
-              <w:t xml:space="preserve">src/components/sidecar/SidecarDisplay.tsx</w:t>
+              <w:t xml:space="preserve">src/components/sidecar/SidecarNavigator.tsx</w:t>
             </w:r>
           </w:p>
         </w:tc>
@@ -1952,7 +1672,7 @@
                 <w:sz w:val="20"/>
                 <w:szCs w:val="20"/>
               </w:rPr>
-              <w:t xml:space="preserve">Result detail + concordance + specimen badge</w:t>
+              <w:t xml:space="preserve">Generic navigator (no longer used in SidecarDrawer — kept for future use)</w:t>
             </w:r>
           </w:p>
         </w:tc>
@@ -1982,7 +1702,7 @@
                 <w:sz w:val="20"/>
                 <w:szCs w:val="20"/>
               </w:rPr>
-              <w:t xml:space="preserve">src/components/sidecar/ComputationalPanel.tsx</w:t>
+              <w:t xml:space="preserve">src/components/sidecar/SidecarDisplay.tsx</w:t>
             </w:r>
           </w:p>
         </w:tc>
@@ -2010,7 +1730,7 @@
                 <w:sz w:val="20"/>
                 <w:szCs w:val="20"/>
               </w:rPr>
-              <w:t xml:space="preserve">Standalone synoptic tab panel with inline navigator, order modal, and cancel</w:t>
+              <w:t xml:space="preserve">Result detail + concordance + specimen badge</w:t>
             </w:r>
           </w:p>
         </w:tc>
@@ -2039,7 +1759,7 @@
                 <w:sz w:val="20"/>
                 <w:szCs w:val="20"/>
               </w:rPr>
-              <w:t xml:space="preserve">src/components/Config/System/DemoResetTab.tsx</w:t>
+              <w:t xml:space="preserve">src/components/sidecar/ComputationalPanel.tsx</w:t>
             </w:r>
           </w:p>
         </w:tc>
@@ -2066,7 +1786,7 @@
                 <w:sz w:val="20"/>
                 <w:szCs w:val="20"/>
               </w:rPr>
-              <w:t xml:space="preserve">Two-level reset UI (my data / full)</w:t>
+              <w:t xml:space="preserve">Synoptic tab panel — grouped navigator, order modal, cancel modal</w:t>
             </w:r>
           </w:p>
         </w:tc>
@@ -2096,7 +1816,7 @@
                 <w:sz w:val="20"/>
                 <w:szCs w:val="20"/>
               </w:rPr>
-              <w:t xml:space="preserve">pathscribe.css additions</w:t>
+              <w:t xml:space="preserve">src/components/Config/System/DemoResetTab.tsx</w:t>
             </w:r>
           </w:p>
         </w:tc>
@@ -2124,7 +1844,7 @@
                 <w:sz w:val="20"/>
                 <w:szCs w:val="20"/>
               </w:rPr>
-              <w:t xml:space="preserve">ps-modal-dark, ps-btn-ghost-dark, ps-btn-amber</w:t>
+              <w:t xml:space="preserve">Two-level reset UI</w:t>
             </w:r>
           </w:p>
         </w:tc>
@@ -2153,7 +1873,7 @@
                 <w:sz w:val="20"/>
                 <w:szCs w:val="20"/>
               </w:rPr>
-              <w:t xml:space="preserve">scripts/reset-mock-data.ts</w:t>
+              <w:t xml:space="preserve">src/components/Audit/useAuditLog.ts</w:t>
             </w:r>
           </w:p>
         </w:tc>
@@ -2180,7 +1900,7 @@
                 <w:sz w:val="20"/>
                 <w:szCs w:val="20"/>
               </w:rPr>
-              <w:t xml:space="preserve">Updated with pathscribe_flags_v2 and flags version keys</w:t>
+              <w:t xml:space="preserve">Extended with all COMP_AUDIT keys (14 new actions)</w:t>
             </w:r>
           </w:p>
         </w:tc>
@@ -2196,19 +1916,19 @@
     </w:p>
     <w:p>
       <w:pPr>
-        <w:pStyle w:val="Heading2"/>
-        <w:spacing w:after="120" w:before="300"/>
+        <w:pStyle w:val="Heading1"/>
+        <w:spacing w:after="160" w:before="400"/>
       </w:pPr>
       <w:r>
         <w:rPr>
           <w:rFonts w:ascii="Arial" w:cs="Arial" w:eastAsia="Arial" w:hAnsi="Arial"/>
           <w:b/>
           <w:bCs/>
-          <w:color w:val="0891B2"/>
-          <w:sz w:val="26"/>
-          <w:szCs w:val="26"/>
-        </w:rPr>
-        <w:t xml:space="preserve">Modified Files</w:t>
+          <w:color w:val="0F172A"/>
+          <w:sz w:val="32"/>
+          <w:szCs w:val="32"/>
+        </w:rPr>
+        <w:t xml:space="preserve">4. Modified Files</w:t>
       </w:r>
     </w:p>
     <w:tbl>
@@ -2318,7 +2038,7 @@
                 <w:sz w:val="20"/>
                 <w:szCs w:val="20"/>
               </w:rPr>
-              <w:t xml:space="preserve">mockFlagService.ts</w:t>
+              <w:t xml:space="preserve">SynopticReportPage.tsx</w:t>
             </w:r>
           </w:p>
         </w:tc>
@@ -2345,7 +2065,7 @@
                 <w:sz w:val="20"/>
                 <w:szCs w:val="20"/>
               </w:rPr>
-              <w:t xml:space="preserve">7 computational flags with tagClass, iconKey, dataSource, synopticFieldIds, defaultProtocolIds</w:t>
+              <w:t xml:space="preserve">caseComputationalFlags enriches with specimenId. refreshCompFlags as useCallback. Fallback returns [] not all flags while caseData loading.</w:t>
             </w:r>
           </w:p>
         </w:tc>
@@ -2432,7 +2152,7 @@
                 <w:sz w:val="20"/>
                 <w:szCs w:val="20"/>
               </w:rPr>
-              <w:t xml:space="preserve">services/index.ts</w:t>
+              <w:t xml:space="preserve">mockFlagService.ts</w:t>
             </w:r>
           </w:p>
         </w:tc>
@@ -2459,7 +2179,7 @@
                 <w:sz w:val="20"/>
                 <w:szCs w:val="20"/>
               </w:rPr>
-              <w:t xml:space="preserve">Added resultService, flagService, caseService, messageService exports</w:t>
+              <w:t xml:space="preserve">7 computational flag definitions. Storage key pathscribe_flags_v2</w:t>
             </w:r>
           </w:p>
         </w:tc>
@@ -2517,7 +2237,7 @@
                 <w:sz w:val="20"/>
                 <w:szCs w:val="20"/>
               </w:rPr>
-              <w:t xml:space="preserve">Loads flagService, SidecarDrawer, closes drawer on mount</w:t>
+              <w:t xml:space="preserve">Computational voice actions registered. SidecarDrawer rendered.</w:t>
             </w:r>
           </w:p>
         </w:tc>
@@ -2573,7 +2293,7 @@
                 <w:sz w:val="20"/>
                 <w:szCs w:val="20"/>
               </w:rPr>
-              <w:t xml:space="preserve">renderFlags() splits computational icons before pills, drawer close guard on row click</w:t>
+              <w:t xml:space="preserve">renderFlags() splits computational icons. STATUS column right padding.</w:t>
             </w:r>
           </w:p>
         </w:tc>
@@ -2603,7 +2323,7 @@
                 <w:sz w:val="20"/>
                 <w:szCs w:val="20"/>
               </w:rPr>
-              <w:t xml:space="preserve">SynopticReportPage.tsx</w:t>
+              <w:t xml:space="preserve">FlagConfigPage.tsx</w:t>
             </w:r>
           </w:p>
         </w:tc>
@@ -2631,7 +2351,7 @@
                 <w:sz w:val="20"/>
                 <w:szCs w:val="20"/>
               </w:rPr>
-              <w:t xml:space="preserve">Computational tab, computationalResults → AI, ps:suggest-protocols listener</w:t>
+              <w:t xml:space="preserve">Two-column modal with DataSourceType selector. useFocusTrap. COMP_AUDIT logging.</w:t>
             </w:r>
           </w:p>
         </w:tc>
@@ -2660,7 +2380,7 @@
                 <w:sz w:val="20"/>
                 <w:szCs w:val="20"/>
               </w:rPr>
-              <w:t xml:space="preserve">RightSynopticPanel.tsx</w:t>
+              <w:t xml:space="preserve">FlagManagerModal.tsx</w:t>
             </w:r>
           </w:p>
         </w:tc>
@@ -2687,7 +2407,7 @@
                 <w:sz w:val="20"/>
                 <w:szCs w:val="20"/>
               </w:rPr>
-              <w:t xml:space="preserve">computationalResults + onAiSuggestionsUpdate props</w:t>
+              <w:t xml:space="preserve">Filters COMPUTATIONAL flags from catalog</w:t>
             </w:r>
           </w:p>
         </w:tc>
@@ -2717,7 +2437,7 @@
                 <w:sz w:val="20"/>
                 <w:szCs w:val="20"/>
               </w:rPr>
-              <w:t xml:space="preserve">FlagConfigPage.tsx</w:t>
+              <w:t xml:space="preserve">ConfigurationPage.tsx</w:t>
             </w:r>
           </w:p>
         </w:tc>
@@ -2745,7 +2465,7 @@
                 <w:sz w:val="20"/>
                 <w:szCs w:val="20"/>
               </w:rPr>
-              <w:t xml:space="preserve">Two-column modal, DataSourceType selector, protocol picker with search</w:t>
+              <w:t xml:space="preserve">Added Demo Reset tab</w:t>
             </w:r>
           </w:p>
         </w:tc>
@@ -2774,7 +2494,7 @@
                 <w:sz w:val="20"/>
                 <w:szCs w:val="20"/>
               </w:rPr>
-              <w:t xml:space="preserve">FlagManagerModal.tsx</w:t>
+              <w:t xml:space="preserve">pathscribe.css</w:t>
             </w:r>
           </w:p>
         </w:tc>
@@ -2801,7 +2521,7 @@
                 <w:sz w:val="20"/>
                 <w:szCs w:val="20"/>
               </w:rPr>
-              <w:t xml:space="preserve">Filters COMPUTATIONAL flags from catalog</w:t>
+              <w:t xml:space="preserve">New: comp-* classes, ps-modal-dark family, ps-btn-ghost-dark, ps-btn-amber, ps-sr-only, ps-radio-hidden, comp-group-count</w:t>
             </w:r>
           </w:p>
         </w:tc>
@@ -2831,7 +2551,7 @@
                 <w:sz w:val="20"/>
                 <w:szCs w:val="20"/>
               </w:rPr>
-              <w:t xml:space="preserve">ConfigurationPage.tsx</w:t>
+              <w:t xml:space="preserve">UnsavedWarningModal.tsx</w:t>
             </w:r>
           </w:p>
         </w:tc>
@@ -2859,7 +2579,63 @@
                 <w:sz w:val="20"/>
                 <w:szCs w:val="20"/>
               </w:rPr>
-              <w:t xml:space="preserve">Added Demo Reset tab</w:t>
+              <w:t xml:space="preserve">role=dialog, aria-modal, useFocusTrap</w:t>
+            </w:r>
+          </w:p>
+        </w:tc>
+      </w:tr>
+      <w:tr>
+        <w:tc>
+          <w:tcPr>
+            <w:tcW w:type="dxa" w:w="4000"/>
+            <w:tcBorders>
+              <w:top w:val="single" w:color="D1D5DB" w:sz="1"/>
+              <w:left w:val="single" w:color="D1D5DB" w:sz="1"/>
+              <w:bottom w:val="single" w:color="D1D5DB" w:sz="1"/>
+              <w:right w:val="single" w:color="D1D5DB" w:sz="1"/>
+            </w:tcBorders>
+            <w:tcMar>
+              <w:top w:type="dxa" w:w="100"/>
+              <w:left w:type="dxa" w:w="120"/>
+              <w:bottom w:type="dxa" w:w="100"/>
+              <w:right w:type="dxa" w:w="120"/>
+            </w:tcMar>
+          </w:tcPr>
+          <w:p>
+            <w:r>
+              <w:rPr>
+                <w:rFonts w:ascii="Arial" w:cs="Arial" w:eastAsia="Arial" w:hAnsi="Arial"/>
+                <w:sz w:val="20"/>
+                <w:szCs w:val="20"/>
+              </w:rPr>
+              <w:t xml:space="preserve">reset-mock-data.ts</w:t>
+            </w:r>
+          </w:p>
+        </w:tc>
+        <w:tc>
+          <w:tcPr>
+            <w:tcW w:type="dxa" w:w="5360"/>
+            <w:tcBorders>
+              <w:top w:val="single" w:color="D1D5DB" w:sz="1"/>
+              <w:left w:val="single" w:color="D1D5DB" w:sz="1"/>
+              <w:bottom w:val="single" w:color="D1D5DB" w:sz="1"/>
+              <w:right w:val="single" w:color="D1D5DB" w:sz="1"/>
+            </w:tcBorders>
+            <w:tcMar>
+              <w:top w:type="dxa" w:w="100"/>
+              <w:left w:type="dxa" w:w="120"/>
+              <w:bottom w:type="dxa" w:w="100"/>
+              <w:right w:type="dxa" w:w="120"/>
+            </w:tcMar>
+          </w:tcPr>
+          <w:p>
+            <w:r>
+              <w:rPr>
+                <w:rFonts w:ascii="Arial" w:cs="Arial" w:eastAsia="Arial" w:hAnsi="Arial"/>
+                <w:sz w:val="20"/>
+                <w:szCs w:val="20"/>
+              </w:rPr>
+              <w:t xml:space="preserve">Added pathscribe_flags_v2 and flags version keys</w:t>
             </w:r>
           </w:p>
         </w:tc>
@@ -2887,7 +2663,7 @@
           <w:sz w:val="32"/>
           <w:szCs w:val="32"/>
         </w:rPr>
-        <w:t xml:space="preserve">4. Key Data Flows</w:t>
+        <w:t xml:space="preserve">5. Key Constants</w:t>
       </w:r>
     </w:p>
     <w:p>
@@ -2904,207 +2680,7 @@
           <w:sz w:val="26"/>
           <w:szCs w:val="26"/>
         </w:rPr>
-        <w:t xml:space="preserve">4.1 Order Workflow (ComputationalPanel)</w:t>
-      </w:r>
-    </w:p>
-    <w:p>
-      <w:pPr>
-        <w:spacing w:after="60" w:before="60"/>
-        <w:ind w:left="720"/>
-      </w:pPr>
-      <w:r>
-        <w:rPr>
-          <w:rFonts w:ascii="Courier New" w:cs="Courier New" w:eastAsia="Courier New" w:hAnsi="Courier New"/>
-          <w:color w:val="374151"/>
-          <w:sz w:val="18"/>
-          <w:szCs w:val="18"/>
-        </w:rPr>
-        <w:t xml:space="preserve">1. "+ Order additional test" → opens modal with specimen selector</w:t>
-      </w:r>
-    </w:p>
-    <w:p>
-      <w:pPr>
-        <w:spacing w:after="60" w:before="60"/>
-        <w:ind w:left="720"/>
-      </w:pPr>
-      <w:r>
-        <w:rPr>
-          <w:rFonts w:ascii="Courier New" w:cs="Courier New" w:eastAsia="Courier New" w:hAnsi="Courier New"/>
-          <w:color w:val="374151"/>
-          <w:sz w:val="18"/>
-          <w:szCs w:val="18"/>
-        </w:rPr>
-        <w:t xml:space="preserve">2. Pathologist selects specimen target + stages tests</w:t>
-      </w:r>
-    </w:p>
-    <w:p>
-      <w:pPr>
-        <w:spacing w:after="60" w:before="60"/>
-        <w:ind w:left="720"/>
-      </w:pPr>
-      <w:r>
-        <w:rPr>
-          <w:rFonts w:ascii="Courier New" w:cs="Courier New" w:eastAsia="Courier New" w:hAnsi="Courier New"/>
-          <w:color w:val="374151"/>
-          <w:sz w:val="18"/>
-          <w:szCs w:val="18"/>
-        </w:rPr>
-        <w:t xml:space="preserve">3. "Place Orders" → for each: flagService.add({ orderedVia: "pathscribe", specimenId })</w:t>
-      </w:r>
-    </w:p>
-    <w:p>
-      <w:pPr>
-        <w:spacing w:after="60" w:before="60"/>
-        <w:ind w:left="720"/>
-      </w:pPr>
-      <w:r>
-        <w:rPr>
-          <w:rFonts w:ascii="Courier New" w:cs="Courier New" w:eastAsia="Courier New" w:hAnsi="Courier New"/>
-          <w:color w:val="374151"/>
-          <w:sz w:val="18"/>
-          <w:szCs w:val="18"/>
-        </w:rPr>
-        <w:t xml:space="preserve">4. messageService.send() — non-blocking lab notification</w:t>
-      </w:r>
-    </w:p>
-    <w:p>
-      <w:pPr>
-        <w:spacing w:after="60" w:before="60"/>
-        <w:ind w:left="720"/>
-      </w:pPr>
-      <w:r>
-        <w:rPr>
-          <w:rFonts w:ascii="Courier New" w:cs="Courier New" w:eastAsia="Courier New" w:hAnsi="Courier New"/>
-          <w:color w:val="374151"/>
-          <w:sz w:val="18"/>
-          <w:szCs w:val="18"/>
-        </w:rPr>
-        <w:t xml:space="preserve">5. ps:suggest-protocols event → SynopticReportPage opens Add Synoptic pre-filtered</w:t>
-      </w:r>
-    </w:p>
-    <w:p>
-      <w:pPr>
-        <w:spacing w:after="60" w:before="60"/>
-        <w:ind w:left="720"/>
-      </w:pPr>
-      <w:r>
-        <w:rPr>
-          <w:rFonts w:ascii="Courier New" w:cs="Courier New" w:eastAsia="Courier New" w:hAnsi="Courier New"/>
-          <w:color w:val="374151"/>
-          <w:sz w:val="18"/>
-          <w:szCs w:val="18"/>
-        </w:rPr>
-        <w:t xml:space="preserve">6. Staged flags move to active list; orderable flags updated</w:t>
-      </w:r>
-    </w:p>
-    <w:p>
-      <w:pPr>
-        <w:spacing w:after="80" w:before="80"/>
-      </w:pPr>
-      <w:r>
-        <w:t xml:space="preserve"/>
-      </w:r>
-    </w:p>
-    <w:p>
-      <w:pPr>
-        <w:pStyle w:val="Heading2"/>
-        <w:spacing w:after="120" w:before="300"/>
-      </w:pPr>
-      <w:r>
-        <w:rPr>
-          <w:rFonts w:ascii="Arial" w:cs="Arial" w:eastAsia="Arial" w:hAnsi="Arial"/>
-          <w:b/>
-          <w:bCs/>
-          <w:color w:val="0891B2"/>
-          <w:sz w:val="26"/>
-          <w:szCs w:val="26"/>
-        </w:rPr>
-        <w:t xml:space="preserve">4.2 Cancel Workflow</w:t>
-      </w:r>
-    </w:p>
-    <w:p>
-      <w:pPr>
-        <w:spacing w:after="60" w:before="60"/>
-        <w:ind w:left="720"/>
-      </w:pPr>
-      <w:r>
-        <w:rPr>
-          <w:rFonts w:ascii="Courier New" w:cs="Courier New" w:eastAsia="Courier New" w:hAnsi="Courier New"/>
-          <w:color w:val="374151"/>
-          <w:sz w:val="18"/>
-          <w:szCs w:val="18"/>
-        </w:rPr>
-        <w:t xml:space="preserve">1. Trash icon click → setCancelTarget(flag)</w:t>
-      </w:r>
-    </w:p>
-    <w:p>
-      <w:pPr>
-        <w:spacing w:after="60" w:before="60"/>
-        <w:ind w:left="720"/>
-      </w:pPr>
-      <w:r>
-        <w:rPr>
-          <w:rFonts w:ascii="Courier New" w:cs="Courier New" w:eastAsia="Courier New" w:hAnsi="Courier New"/>
-          <w:color w:val="374151"/>
-          <w:sz w:val="18"/>
-          <w:szCs w:val="18"/>
-        </w:rPr>
-        <w:t xml:space="preserve">2. Modal shows — orderedVia determines messaging variant</w:t>
-      </w:r>
-    </w:p>
-    <w:p>
-      <w:pPr>
-        <w:spacing w:after="60" w:before="60"/>
-        <w:ind w:left="720"/>
-      </w:pPr>
-      <w:r>
-        <w:rPr>
-          <w:rFonts w:ascii="Courier New" w:cs="Courier New" w:eastAsia="Courier New" w:hAnsi="Courier New"/>
-          <w:color w:val="374151"/>
-          <w:sz w:val="18"/>
-          <w:szCs w:val="18"/>
-        </w:rPr>
-        <w:t xml:space="preserve">3. Confirm → messageService.send(cancel) → flag removed from case</w:t>
-      </w:r>
-    </w:p>
-    <w:p>
-      <w:pPr>
-        <w:spacing w:after="60" w:before="60"/>
-        <w:ind w:left="720"/>
-      </w:pPr>
-      <w:r>
-        <w:rPr>
-          <w:rFonts w:ascii="Courier New" w:cs="Courier New" w:eastAsia="Courier New" w:hAnsi="Courier New"/>
-          <w:color w:val="374151"/>
-          <w:sz w:val="18"/>
-          <w:szCs w:val="18"/>
-        </w:rPr>
-        <w:t xml:space="preserve">4. Flag returns to orderable list</w:t>
-      </w:r>
-    </w:p>
-    <w:p>
-      <w:pPr>
-        <w:spacing w:after="80" w:before="80"/>
-      </w:pPr>
-      <w:r>
-        <w:t xml:space="preserve"/>
-      </w:r>
-    </w:p>
-    <w:p>
-      <w:pPr>
-        <w:pStyle w:val="Heading1"/>
-        <w:spacing w:after="160" w:before="400"/>
-      </w:pPr>
-      <w:r>
-        <w:rPr>
-          <w:rFonts w:ascii="Arial" w:cs="Arial" w:eastAsia="Arial" w:hAnsi="Arial"/>
-          <w:b/>
-          <w:bCs/>
-          <w:color w:val="0F172A"/>
-          <w:sz w:val="32"/>
-          <w:szCs w:val="32"/>
-        </w:rPr>
-        <w:t xml:space="preserve">5. localStorage Keys</w:t>
+        <w:t xml:space="preserve">localStorage Keys</w:t>
       </w:r>
     </w:p>
     <w:tbl>
@@ -3300,7 +2876,7 @@
                 <w:sz w:val="20"/>
                 <w:szCs w:val="20"/>
               </w:rPr>
-              <w:t xml:space="preserve">Bumped from pathscribe_flags</w:t>
+              <w:t xml:space="preserve">Flag catalog. Bumped from pathscribe_flags</w:t>
             </w:r>
           </w:p>
         </w:tc>
@@ -3569,7 +3145,7 @@
           <w:sz w:val="22"/>
           <w:szCs w:val="22"/>
         </w:rPr>
-        <w:t xml:space="preserve">orderedVia defaults to "lis" if absent — any legacy applied flags without the field show the LIS warning</w:t>
+        <w:t xml:space="preserve">orderedVia defaults to "lis" if absent — legacy entries show LIS warning on cancel</w:t>
       </w:r>
     </w:p>
     <w:p>
@@ -3587,7 +3163,32 @@
           <w:sz w:val="22"/>
           <w:szCs w:val="22"/>
         </w:rPr>
-        <w:t xml:space="preserve">MockResultService keys use underscore separator (sourceId_caseId) — esbuild limitation</w:t>
+        <w:t xml:space="preserve">Specimen assignment uses lisCode as proxy — one lisCode per case only (no duplicate tests on different specimens)</w:t>
+      </w:r>
+    </w:p>
+    <w:p>
+      <w:pPr>
+        <w:spacing w:after="80" w:before="80"/>
+      </w:pPr>
+      <w:r>
+        <w:t xml:space="preserve"/>
+      </w:r>
+    </w:p>
+    <w:p>
+      <w:pPr>
+        <w:pStyle w:val="Heading1"/>
+        <w:spacing w:after="160" w:before="400"/>
+      </w:pPr>
+      <w:r>
+        <w:rPr>
+          <w:rFonts w:ascii="Arial" w:cs="Arial" w:eastAsia="Arial" w:hAnsi="Arial"/>
+          <w:b/>
+          <w:bCs/>
+          <w:color w:val="0F172A"/>
+          <w:sz w:val="32"/>
+          <w:szCs w:val="32"/>
+        </w:rPr>
+        <w:t xml:space="preserve">7. V2 Backlog</w:t>
       </w:r>
     </w:p>
     <w:p>
@@ -3605,32 +3206,7 @@
           <w:sz w:val="22"/>
           <w:szCs w:val="22"/>
         </w:rPr>
-        <w:t xml:space="preserve">specimenId on applied flags is informational only — no server-side validation that the specimen belongs to the case</w:t>
-      </w:r>
-    </w:p>
-    <w:p>
-      <w:pPr>
-        <w:spacing w:after="80" w:before="80"/>
-      </w:pPr>
-      <w:r>
-        <w:t xml:space="preserve"/>
-      </w:r>
-    </w:p>
-    <w:p>
-      <w:pPr>
-        <w:pStyle w:val="Heading1"/>
-        <w:spacing w:after="160" w:before="400"/>
-      </w:pPr>
-      <w:r>
-        <w:rPr>
-          <w:rFonts w:ascii="Arial" w:cs="Arial" w:eastAsia="Arial" w:hAnsi="Arial"/>
-          <w:b/>
-          <w:bCs/>
-          <w:color w:val="0F172A"/>
-          <w:sz w:val="32"/>
-          <w:szCs w:val="32"/>
-        </w:rPr>
-        <w:t xml:space="preserve">7. V2 Backlog</w:t>
+        <w:t xml:space="preserve">HL7 ORM order + ORC-1 cancel messages to LIS</w:t>
       </w:r>
     </w:p>
     <w:p>
@@ -3648,7 +3224,7 @@
           <w:sz w:val="22"/>
           <w:szCs w:val="22"/>
         </w:rPr>
-        <w:t xml:space="preserve">AI-triggered protocol suggestion on FINAL result arrival</w:t>
+        <w:t xml:space="preserve">Real LIS endpoint integration and polling</w:t>
       </w:r>
     </w:p>
     <w:p>
@@ -3666,7 +3242,7 @@
           <w:sz w:val="22"/>
           <w:szCs w:val="22"/>
         </w:rPr>
-        <w:t xml:space="preserve">HL7 ORM order message to LIS (replaces PathScribe internal message)</w:t>
+        <w:t xml:space="preserve">Field-level concordance using actual template field IDs</w:t>
       </w:r>
     </w:p>
     <w:p>
@@ -3684,7 +3260,7 @@
           <w:sz w:val="22"/>
           <w:szCs w:val="22"/>
         </w:rPr>
-        <w:t xml:space="preserve">HL7 cancel message (ORC-1: CA) for LIS-originated cancellations</w:t>
+        <w:t xml:space="preserve">Re-run AI suggestions when FINAL result arrives</w:t>
       </w:r>
     </w:p>
     <w:p>
@@ -3702,7 +3278,7 @@
           <w:sz w:val="22"/>
           <w:szCs w:val="22"/>
         </w:rPr>
-        <w:t xml:space="preserve">Real LIS endpoint integration and polling</w:t>
+        <w:t xml:space="preserve">Attending approval workflow for ordering</w:t>
       </w:r>
     </w:p>
     <w:p>
@@ -3720,7 +3296,7 @@
           <w:sz w:val="22"/>
           <w:szCs w:val="22"/>
         </w:rPr>
-        <w:t xml:space="preserve">Field-level concordance using actual template field IDs</w:t>
+        <w:t xml:space="preserve">Role-based access control for order/cancel</w:t>
       </w:r>
     </w:p>
     <w:p>
@@ -3738,43 +3314,7 @@
           <w:sz w:val="22"/>
           <w:szCs w:val="22"/>
         </w:rPr>
-        <w:t xml:space="preserve">Re-run AI suggestions when FINAL result arrives</w:t>
-      </w:r>
-    </w:p>
-    <w:p>
-      <w:pPr>
-        <w:pStyle w:val="ListParagraph"/>
-        <w:numPr>
-          <w:ilvl w:val="0"/>
-          <w:numId w:val="2"/>
-        </w:numPr>
-        <w:spacing w:after="40" w:before="40"/>
-      </w:pPr>
-      <w:r>
-        <w:rPr>
-          <w:rFonts w:ascii="Arial" w:cs="Arial" w:eastAsia="Arial" w:hAnsi="Arial"/>
-          <w:sz w:val="22"/>
-          <w:szCs w:val="22"/>
-        </w:rPr>
-        <w:t xml:space="preserve">Attending approval workflow for ordering ancillary tests</w:t>
-      </w:r>
-    </w:p>
-    <w:p>
-      <w:pPr>
-        <w:pStyle w:val="ListParagraph"/>
-        <w:numPr>
-          <w:ilvl w:val="0"/>
-          <w:numId w:val="2"/>
-        </w:numPr>
-        <w:spacing w:after="40" w:before="40"/>
-      </w:pPr>
-      <w:r>
-        <w:rPr>
-          <w:rFonts w:ascii="Arial" w:cs="Arial" w:eastAsia="Arial" w:hAnsi="Arial"/>
-          <w:sz w:val="22"/>
-          <w:szCs w:val="22"/>
-        </w:rPr>
-        <w:t xml:space="preserve">Role-based access control for the order/cancel workflow</w:t>
+        <w:t xml:space="preserve">Multiple instances of same test on different specimens (currently de-duplicated by lisCode)</w:t>
       </w:r>
     </w:p>
     <w:sectPr>
@@ -3964,18 +3504,6 @@
     </w:lvl>
   </w:abstractNum>
   <w:abstractNum w:abstractNumId="3" w15:restartNumberingAfterBreak="0">
-    <w:multiLevelType w:val="hybridMultilevel"/>
-    <w:lvl w:ilvl="0" w15:tentative="1">
-      <w:start w:val="1"/>
-      <w:numFmt w:val="decimal"/>
-      <w:lvlText w:val="%1."/>
-      <w:lvlJc w:val="left"/>
-      <w:pPr>
-        <w:ind w:left="720" w:hanging="360"/>
-      </w:pPr>
-    </w:lvl>
-  </w:abstractNum>
-  <w:abstractNum w:abstractNumId="4" w15:restartNumberingAfterBreak="0">
     <w:multiLevelType w:val="hybridMultilevel"/>
     <w:lvl w:ilvl="0" w15:tentative="1">
       <w:start w:val="1"/>

</xml_diff>